<commit_message>
change markers to 20x20mm size
Signed-off-by: King Hua <kinghua0629@outlook.com>
</commit_message>
<xml_diff>
--- a/handeye_calibration/markers/markers.docx
+++ b/handeye_calibration/markers/markers.docx
@@ -8,9 +8,9 @@
           <w:noProof/>
         </w:rPr>
         <w:drawing>
-          <wp:inline distT="0" distB="0" distL="0" distR="0" wp14:anchorId="2B06F0D7" wp14:editId="44522805">
-            <wp:extent cx="1080000" cy="1080000"/>
-            <wp:effectExtent l="0" t="0" r="0" b="0"/>
+          <wp:inline distT="0" distB="0" distL="0" distR="0" wp14:anchorId="2B06F0D7" wp14:editId="37ABAB0D">
+            <wp:extent cx="720000" cy="720000"/>
+            <wp:effectExtent l="0" t="0" r="4445" b="4445"/>
             <wp:docPr id="1859451869" name="图片 1"/>
             <wp:cNvGraphicFramePr>
               <a:graphicFrameLocks xmlns:a="http://schemas.openxmlformats.org/drawingml/2006/main" noChangeAspect="1"/>
@@ -23,21 +23,21 @@
                     <pic:cNvPicPr/>
                   </pic:nvPicPr>
                   <pic:blipFill>
-                    <a:blip r:embed="rId4">
-                      <a:extLst>
-                        <a:ext uri="{28A0092B-C50C-407E-A947-70E740481C1C}">
-                          <a14:useLocalDpi xmlns:a14="http://schemas.microsoft.com/office/drawing/2010/main" val="0"/>
-                        </a:ext>
-                      </a:extLst>
-                    </a:blip>
-                    <a:stretch>
-                      <a:fillRect/>
-                    </a:stretch>
-                  </pic:blipFill>
-                  <pic:spPr>
-                    <a:xfrm>
-                      <a:off x="0" y="0"/>
-                      <a:ext cx="1080000" cy="1080000"/>
+                    <a:blip r:embed="rId4" cstate="print">
+                      <a:extLst>
+                        <a:ext uri="{28A0092B-C50C-407E-A947-70E740481C1C}">
+                          <a14:useLocalDpi xmlns:a14="http://schemas.microsoft.com/office/drawing/2010/main" val="0"/>
+                        </a:ext>
+                      </a:extLst>
+                    </a:blip>
+                    <a:stretch>
+                      <a:fillRect/>
+                    </a:stretch>
+                  </pic:blipFill>
+                  <pic:spPr>
+                    <a:xfrm>
+                      <a:off x="0" y="0"/>
+                      <a:ext cx="720000" cy="720000"/>
                     </a:xfrm>
                     <a:prstGeom prst="rect">
                       <a:avLst/>
@@ -57,9 +57,9 @@
           <w:noProof/>
         </w:rPr>
         <w:drawing>
-          <wp:inline distT="0" distB="0" distL="0" distR="0" wp14:anchorId="6EED9D56" wp14:editId="3F6F8C2B">
-            <wp:extent cx="1080000" cy="1080000"/>
-            <wp:effectExtent l="0" t="0" r="0" b="0"/>
+          <wp:inline distT="0" distB="0" distL="0" distR="0" wp14:anchorId="6EED9D56" wp14:editId="09EBD734">
+            <wp:extent cx="720000" cy="720000"/>
+            <wp:effectExtent l="0" t="0" r="4445" b="4445"/>
             <wp:docPr id="1371579297" name="图片 5"/>
             <wp:cNvGraphicFramePr>
               <a:graphicFrameLocks xmlns:a="http://schemas.openxmlformats.org/drawingml/2006/main" noChangeAspect="1"/>
@@ -72,21 +72,21 @@
                     <pic:cNvPicPr/>
                   </pic:nvPicPr>
                   <pic:blipFill>
-                    <a:blip r:embed="rId5">
-                      <a:extLst>
-                        <a:ext uri="{28A0092B-C50C-407E-A947-70E740481C1C}">
-                          <a14:useLocalDpi xmlns:a14="http://schemas.microsoft.com/office/drawing/2010/main" val="0"/>
-                        </a:ext>
-                      </a:extLst>
-                    </a:blip>
-                    <a:stretch>
-                      <a:fillRect/>
-                    </a:stretch>
-                  </pic:blipFill>
-                  <pic:spPr>
-                    <a:xfrm>
-                      <a:off x="0" y="0"/>
-                      <a:ext cx="1080000" cy="1080000"/>
+                    <a:blip r:embed="rId5" cstate="print">
+                      <a:extLst>
+                        <a:ext uri="{28A0092B-C50C-407E-A947-70E740481C1C}">
+                          <a14:useLocalDpi xmlns:a14="http://schemas.microsoft.com/office/drawing/2010/main" val="0"/>
+                        </a:ext>
+                      </a:extLst>
+                    </a:blip>
+                    <a:stretch>
+                      <a:fillRect/>
+                    </a:stretch>
+                  </pic:blipFill>
+                  <pic:spPr>
+                    <a:xfrm>
+                      <a:off x="0" y="0"/>
+                      <a:ext cx="720000" cy="720000"/>
                     </a:xfrm>
                     <a:prstGeom prst="rect">
                       <a:avLst/>
@@ -106,9 +106,9 @@
           <w:noProof/>
         </w:rPr>
         <w:drawing>
-          <wp:inline distT="0" distB="0" distL="0" distR="0" wp14:anchorId="7A020CDB" wp14:editId="1BD5BA93">
-            <wp:extent cx="1080000" cy="1080000"/>
-            <wp:effectExtent l="0" t="0" r="0" b="0"/>
+          <wp:inline distT="0" distB="0" distL="0" distR="0" wp14:anchorId="7A020CDB" wp14:editId="0182971D">
+            <wp:extent cx="720000" cy="720000"/>
+            <wp:effectExtent l="0" t="0" r="4445" b="4445"/>
             <wp:docPr id="931392833" name="图片 6"/>
             <wp:cNvGraphicFramePr>
               <a:graphicFrameLocks xmlns:a="http://schemas.openxmlformats.org/drawingml/2006/main" noChangeAspect="1"/>
@@ -121,21 +121,21 @@
                     <pic:cNvPicPr/>
                   </pic:nvPicPr>
                   <pic:blipFill>
-                    <a:blip r:embed="rId6">
-                      <a:extLst>
-                        <a:ext uri="{28A0092B-C50C-407E-A947-70E740481C1C}">
-                          <a14:useLocalDpi xmlns:a14="http://schemas.microsoft.com/office/drawing/2010/main" val="0"/>
-                        </a:ext>
-                      </a:extLst>
-                    </a:blip>
-                    <a:stretch>
-                      <a:fillRect/>
-                    </a:stretch>
-                  </pic:blipFill>
-                  <pic:spPr>
-                    <a:xfrm>
-                      <a:off x="0" y="0"/>
-                      <a:ext cx="1080000" cy="1080000"/>
+                    <a:blip r:embed="rId6" cstate="print">
+                      <a:extLst>
+                        <a:ext uri="{28A0092B-C50C-407E-A947-70E740481C1C}">
+                          <a14:useLocalDpi xmlns:a14="http://schemas.microsoft.com/office/drawing/2010/main" val="0"/>
+                        </a:ext>
+                      </a:extLst>
+                    </a:blip>
+                    <a:stretch>
+                      <a:fillRect/>
+                    </a:stretch>
+                  </pic:blipFill>
+                  <pic:spPr>
+                    <a:xfrm>
+                      <a:off x="0" y="0"/>
+                      <a:ext cx="720000" cy="720000"/>
                     </a:xfrm>
                     <a:prstGeom prst="rect">
                       <a:avLst/>
@@ -155,9 +155,9 @@
           <w:noProof/>
         </w:rPr>
         <w:drawing>
-          <wp:inline distT="0" distB="0" distL="0" distR="0" wp14:anchorId="28C3CF1B" wp14:editId="71FE8B79">
-            <wp:extent cx="1080000" cy="1080000"/>
-            <wp:effectExtent l="0" t="0" r="0" b="0"/>
+          <wp:inline distT="0" distB="0" distL="0" distR="0" wp14:anchorId="28C3CF1B" wp14:editId="6901B4D1">
+            <wp:extent cx="720000" cy="720000"/>
+            <wp:effectExtent l="0" t="0" r="4445" b="4445"/>
             <wp:docPr id="1121889337" name="图片 7"/>
             <wp:cNvGraphicFramePr>
               <a:graphicFrameLocks xmlns:a="http://schemas.openxmlformats.org/drawingml/2006/main" noChangeAspect="1"/>
@@ -170,21 +170,21 @@
                     <pic:cNvPicPr/>
                   </pic:nvPicPr>
                   <pic:blipFill>
-                    <a:blip r:embed="rId7">
-                      <a:extLst>
-                        <a:ext uri="{28A0092B-C50C-407E-A947-70E740481C1C}">
-                          <a14:useLocalDpi xmlns:a14="http://schemas.microsoft.com/office/drawing/2010/main" val="0"/>
-                        </a:ext>
-                      </a:extLst>
-                    </a:blip>
-                    <a:stretch>
-                      <a:fillRect/>
-                    </a:stretch>
-                  </pic:blipFill>
-                  <pic:spPr>
-                    <a:xfrm>
-                      <a:off x="0" y="0"/>
-                      <a:ext cx="1080000" cy="1080000"/>
+                    <a:blip r:embed="rId7" cstate="print">
+                      <a:extLst>
+                        <a:ext uri="{28A0092B-C50C-407E-A947-70E740481C1C}">
+                          <a14:useLocalDpi xmlns:a14="http://schemas.microsoft.com/office/drawing/2010/main" val="0"/>
+                        </a:ext>
+                      </a:extLst>
+                    </a:blip>
+                    <a:stretch>
+                      <a:fillRect/>
+                    </a:stretch>
+                  </pic:blipFill>
+                  <pic:spPr>
+                    <a:xfrm>
+                      <a:off x="0" y="0"/>
+                      <a:ext cx="720000" cy="720000"/>
                     </a:xfrm>
                     <a:prstGeom prst="rect">
                       <a:avLst/>
@@ -204,10 +204,10 @@
           <w:noProof/>
         </w:rPr>
         <w:drawing>
-          <wp:inline distT="0" distB="0" distL="0" distR="0" wp14:anchorId="32026902" wp14:editId="21835250">
-            <wp:extent cx="1080000" cy="1080000"/>
-            <wp:effectExtent l="0" t="0" r="0" b="0"/>
-            <wp:docPr id="1524649862" name="图片 1"/>
+          <wp:inline distT="0" distB="0" distL="0" distR="0" wp14:anchorId="46EA9101" wp14:editId="6F03347E">
+            <wp:extent cx="720000" cy="720000"/>
+            <wp:effectExtent l="0" t="0" r="4445" b="4445"/>
+            <wp:docPr id="1620736401" name="图片 1"/>
             <wp:cNvGraphicFramePr>
               <a:graphicFrameLocks xmlns:a="http://schemas.openxmlformats.org/drawingml/2006/main" noChangeAspect="1"/>
             </wp:cNvGraphicFramePr>
@@ -219,21 +219,21 @@
                     <pic:cNvPicPr/>
                   </pic:nvPicPr>
                   <pic:blipFill>
-                    <a:blip r:embed="rId4">
-                      <a:extLst>
-                        <a:ext uri="{28A0092B-C50C-407E-A947-70E740481C1C}">
-                          <a14:useLocalDpi xmlns:a14="http://schemas.microsoft.com/office/drawing/2010/main" val="0"/>
-                        </a:ext>
-                      </a:extLst>
-                    </a:blip>
-                    <a:stretch>
-                      <a:fillRect/>
-                    </a:stretch>
-                  </pic:blipFill>
-                  <pic:spPr>
-                    <a:xfrm>
-                      <a:off x="0" y="0"/>
-                      <a:ext cx="1080000" cy="1080000"/>
+                    <a:blip r:embed="rId4" cstate="print">
+                      <a:extLst>
+                        <a:ext uri="{28A0092B-C50C-407E-A947-70E740481C1C}">
+                          <a14:useLocalDpi xmlns:a14="http://schemas.microsoft.com/office/drawing/2010/main" val="0"/>
+                        </a:ext>
+                      </a:extLst>
+                    </a:blip>
+                    <a:stretch>
+                      <a:fillRect/>
+                    </a:stretch>
+                  </pic:blipFill>
+                  <pic:spPr>
+                    <a:xfrm>
+                      <a:off x="0" y="0"/>
+                      <a:ext cx="720000" cy="720000"/>
                     </a:xfrm>
                     <a:prstGeom prst="rect">
                       <a:avLst/>
@@ -253,10 +253,10 @@
           <w:noProof/>
         </w:rPr>
         <w:drawing>
-          <wp:inline distT="0" distB="0" distL="0" distR="0" wp14:anchorId="69467DEB" wp14:editId="50598706">
-            <wp:extent cx="1080000" cy="1080000"/>
-            <wp:effectExtent l="0" t="0" r="0" b="0"/>
-            <wp:docPr id="124882017" name="图片 5"/>
+          <wp:inline distT="0" distB="0" distL="0" distR="0" wp14:anchorId="6568882F" wp14:editId="3106DAC3">
+            <wp:extent cx="720000" cy="720000"/>
+            <wp:effectExtent l="0" t="0" r="4445" b="4445"/>
+            <wp:docPr id="955177046" name="图片 5"/>
             <wp:cNvGraphicFramePr>
               <a:graphicFrameLocks xmlns:a="http://schemas.openxmlformats.org/drawingml/2006/main" noChangeAspect="1"/>
             </wp:cNvGraphicFramePr>
@@ -268,21 +268,21 @@
                     <pic:cNvPicPr/>
                   </pic:nvPicPr>
                   <pic:blipFill>
-                    <a:blip r:embed="rId5">
-                      <a:extLst>
-                        <a:ext uri="{28A0092B-C50C-407E-A947-70E740481C1C}">
-                          <a14:useLocalDpi xmlns:a14="http://schemas.microsoft.com/office/drawing/2010/main" val="0"/>
-                        </a:ext>
-                      </a:extLst>
-                    </a:blip>
-                    <a:stretch>
-                      <a:fillRect/>
-                    </a:stretch>
-                  </pic:blipFill>
-                  <pic:spPr>
-                    <a:xfrm>
-                      <a:off x="0" y="0"/>
-                      <a:ext cx="1080000" cy="1080000"/>
+                    <a:blip r:embed="rId5" cstate="print">
+                      <a:extLst>
+                        <a:ext uri="{28A0092B-C50C-407E-A947-70E740481C1C}">
+                          <a14:useLocalDpi xmlns:a14="http://schemas.microsoft.com/office/drawing/2010/main" val="0"/>
+                        </a:ext>
+                      </a:extLst>
+                    </a:blip>
+                    <a:stretch>
+                      <a:fillRect/>
+                    </a:stretch>
+                  </pic:blipFill>
+                  <pic:spPr>
+                    <a:xfrm>
+                      <a:off x="0" y="0"/>
+                      <a:ext cx="720000" cy="720000"/>
                     </a:xfrm>
                     <a:prstGeom prst="rect">
                       <a:avLst/>
@@ -302,10 +302,10 @@
           <w:noProof/>
         </w:rPr>
         <w:drawing>
-          <wp:inline distT="0" distB="0" distL="0" distR="0" wp14:anchorId="7F75CD2A" wp14:editId="654CC0B6">
-            <wp:extent cx="1080000" cy="1080000"/>
-            <wp:effectExtent l="0" t="0" r="0" b="0"/>
-            <wp:docPr id="544002765" name="图片 6"/>
+          <wp:inline distT="0" distB="0" distL="0" distR="0" wp14:anchorId="2B5D206B" wp14:editId="7BF2E9F8">
+            <wp:extent cx="720000" cy="720000"/>
+            <wp:effectExtent l="0" t="0" r="4445" b="4445"/>
+            <wp:docPr id="542204857" name="图片 6"/>
             <wp:cNvGraphicFramePr>
               <a:graphicFrameLocks xmlns:a="http://schemas.openxmlformats.org/drawingml/2006/main" noChangeAspect="1"/>
             </wp:cNvGraphicFramePr>
@@ -317,21 +317,21 @@
                     <pic:cNvPicPr/>
                   </pic:nvPicPr>
                   <pic:blipFill>
-                    <a:blip r:embed="rId6">
-                      <a:extLst>
-                        <a:ext uri="{28A0092B-C50C-407E-A947-70E740481C1C}">
-                          <a14:useLocalDpi xmlns:a14="http://schemas.microsoft.com/office/drawing/2010/main" val="0"/>
-                        </a:ext>
-                      </a:extLst>
-                    </a:blip>
-                    <a:stretch>
-                      <a:fillRect/>
-                    </a:stretch>
-                  </pic:blipFill>
-                  <pic:spPr>
-                    <a:xfrm>
-                      <a:off x="0" y="0"/>
-                      <a:ext cx="1080000" cy="1080000"/>
+                    <a:blip r:embed="rId6" cstate="print">
+                      <a:extLst>
+                        <a:ext uri="{28A0092B-C50C-407E-A947-70E740481C1C}">
+                          <a14:useLocalDpi xmlns:a14="http://schemas.microsoft.com/office/drawing/2010/main" val="0"/>
+                        </a:ext>
+                      </a:extLst>
+                    </a:blip>
+                    <a:stretch>
+                      <a:fillRect/>
+                    </a:stretch>
+                  </pic:blipFill>
+                  <pic:spPr>
+                    <a:xfrm>
+                      <a:off x="0" y="0"/>
+                      <a:ext cx="720000" cy="720000"/>
                     </a:xfrm>
                     <a:prstGeom prst="rect">
                       <a:avLst/>
@@ -351,10 +351,10 @@
           <w:noProof/>
         </w:rPr>
         <w:drawing>
-          <wp:inline distT="0" distB="0" distL="0" distR="0" wp14:anchorId="0F26F85C" wp14:editId="6512927F">
-            <wp:extent cx="1080000" cy="1080000"/>
-            <wp:effectExtent l="0" t="0" r="0" b="0"/>
-            <wp:docPr id="333726300" name="图片 7"/>
+          <wp:inline distT="0" distB="0" distL="0" distR="0" wp14:anchorId="6A15DB9E" wp14:editId="08E95F1F">
+            <wp:extent cx="720000" cy="720000"/>
+            <wp:effectExtent l="0" t="0" r="4445" b="4445"/>
+            <wp:docPr id="460370773" name="图片 7"/>
             <wp:cNvGraphicFramePr>
               <a:graphicFrameLocks xmlns:a="http://schemas.openxmlformats.org/drawingml/2006/main" noChangeAspect="1"/>
             </wp:cNvGraphicFramePr>
@@ -366,21 +366,21 @@
                     <pic:cNvPicPr/>
                   </pic:nvPicPr>
                   <pic:blipFill>
-                    <a:blip r:embed="rId7">
-                      <a:extLst>
-                        <a:ext uri="{28A0092B-C50C-407E-A947-70E740481C1C}">
-                          <a14:useLocalDpi xmlns:a14="http://schemas.microsoft.com/office/drawing/2010/main" val="0"/>
-                        </a:ext>
-                      </a:extLst>
-                    </a:blip>
-                    <a:stretch>
-                      <a:fillRect/>
-                    </a:stretch>
-                  </pic:blipFill>
-                  <pic:spPr>
-                    <a:xfrm>
-                      <a:off x="0" y="0"/>
-                      <a:ext cx="1080000" cy="1080000"/>
+                    <a:blip r:embed="rId7" cstate="print">
+                      <a:extLst>
+                        <a:ext uri="{28A0092B-C50C-407E-A947-70E740481C1C}">
+                          <a14:useLocalDpi xmlns:a14="http://schemas.microsoft.com/office/drawing/2010/main" val="0"/>
+                        </a:ext>
+                      </a:extLst>
+                    </a:blip>
+                    <a:stretch>
+                      <a:fillRect/>
+                    </a:stretch>
+                  </pic:blipFill>
+                  <pic:spPr>
+                    <a:xfrm>
+                      <a:off x="0" y="0"/>
+                      <a:ext cx="720000" cy="720000"/>
                     </a:xfrm>
                     <a:prstGeom prst="rect">
                       <a:avLst/>
@@ -400,10 +400,10 @@
           <w:noProof/>
         </w:rPr>
         <w:drawing>
-          <wp:inline distT="0" distB="0" distL="0" distR="0" wp14:anchorId="2E744C4B" wp14:editId="3E9F9F28">
-            <wp:extent cx="1080000" cy="1080000"/>
-            <wp:effectExtent l="0" t="0" r="0" b="0"/>
-            <wp:docPr id="201874595" name="图片 1"/>
+          <wp:inline distT="0" distB="0" distL="0" distR="0" wp14:anchorId="51A96741" wp14:editId="1231507C">
+            <wp:extent cx="720000" cy="720000"/>
+            <wp:effectExtent l="0" t="0" r="4445" b="4445"/>
+            <wp:docPr id="564662800" name="图片 1"/>
             <wp:cNvGraphicFramePr>
               <a:graphicFrameLocks xmlns:a="http://schemas.openxmlformats.org/drawingml/2006/main" noChangeAspect="1"/>
             </wp:cNvGraphicFramePr>
@@ -415,21 +415,21 @@
                     <pic:cNvPicPr/>
                   </pic:nvPicPr>
                   <pic:blipFill>
-                    <a:blip r:embed="rId4">
-                      <a:extLst>
-                        <a:ext uri="{28A0092B-C50C-407E-A947-70E740481C1C}">
-                          <a14:useLocalDpi xmlns:a14="http://schemas.microsoft.com/office/drawing/2010/main" val="0"/>
-                        </a:ext>
-                      </a:extLst>
-                    </a:blip>
-                    <a:stretch>
-                      <a:fillRect/>
-                    </a:stretch>
-                  </pic:blipFill>
-                  <pic:spPr>
-                    <a:xfrm>
-                      <a:off x="0" y="0"/>
-                      <a:ext cx="1080000" cy="1080000"/>
+                    <a:blip r:embed="rId4" cstate="print">
+                      <a:extLst>
+                        <a:ext uri="{28A0092B-C50C-407E-A947-70E740481C1C}">
+                          <a14:useLocalDpi xmlns:a14="http://schemas.microsoft.com/office/drawing/2010/main" val="0"/>
+                        </a:ext>
+                      </a:extLst>
+                    </a:blip>
+                    <a:stretch>
+                      <a:fillRect/>
+                    </a:stretch>
+                  </pic:blipFill>
+                  <pic:spPr>
+                    <a:xfrm>
+                      <a:off x="0" y="0"/>
+                      <a:ext cx="720000" cy="720000"/>
                     </a:xfrm>
                     <a:prstGeom prst="rect">
                       <a:avLst/>
@@ -449,10 +449,10 @@
           <w:noProof/>
         </w:rPr>
         <w:drawing>
-          <wp:inline distT="0" distB="0" distL="0" distR="0" wp14:anchorId="07FD6ACD" wp14:editId="1FF6EA81">
-            <wp:extent cx="1080000" cy="1080000"/>
-            <wp:effectExtent l="0" t="0" r="0" b="0"/>
-            <wp:docPr id="1702670839" name="图片 5"/>
+          <wp:inline distT="0" distB="0" distL="0" distR="0" wp14:anchorId="53C73973" wp14:editId="01BB86DC">
+            <wp:extent cx="720000" cy="720000"/>
+            <wp:effectExtent l="0" t="0" r="4445" b="4445"/>
+            <wp:docPr id="1168982825" name="图片 5"/>
             <wp:cNvGraphicFramePr>
               <a:graphicFrameLocks xmlns:a="http://schemas.openxmlformats.org/drawingml/2006/main" noChangeAspect="1"/>
             </wp:cNvGraphicFramePr>
@@ -464,21 +464,21 @@
                     <pic:cNvPicPr/>
                   </pic:nvPicPr>
                   <pic:blipFill>
-                    <a:blip r:embed="rId5">
-                      <a:extLst>
-                        <a:ext uri="{28A0092B-C50C-407E-A947-70E740481C1C}">
-                          <a14:useLocalDpi xmlns:a14="http://schemas.microsoft.com/office/drawing/2010/main" val="0"/>
-                        </a:ext>
-                      </a:extLst>
-                    </a:blip>
-                    <a:stretch>
-                      <a:fillRect/>
-                    </a:stretch>
-                  </pic:blipFill>
-                  <pic:spPr>
-                    <a:xfrm>
-                      <a:off x="0" y="0"/>
-                      <a:ext cx="1080000" cy="1080000"/>
+                    <a:blip r:embed="rId5" cstate="print">
+                      <a:extLst>
+                        <a:ext uri="{28A0092B-C50C-407E-A947-70E740481C1C}">
+                          <a14:useLocalDpi xmlns:a14="http://schemas.microsoft.com/office/drawing/2010/main" val="0"/>
+                        </a:ext>
+                      </a:extLst>
+                    </a:blip>
+                    <a:stretch>
+                      <a:fillRect/>
+                    </a:stretch>
+                  </pic:blipFill>
+                  <pic:spPr>
+                    <a:xfrm>
+                      <a:off x="0" y="0"/>
+                      <a:ext cx="720000" cy="720000"/>
                     </a:xfrm>
                     <a:prstGeom prst="rect">
                       <a:avLst/>
@@ -498,10 +498,10 @@
           <w:noProof/>
         </w:rPr>
         <w:drawing>
-          <wp:inline distT="0" distB="0" distL="0" distR="0" wp14:anchorId="4798D2F4" wp14:editId="4CE1AF16">
-            <wp:extent cx="1080000" cy="1080000"/>
-            <wp:effectExtent l="0" t="0" r="0" b="0"/>
-            <wp:docPr id="1509375779" name="图片 6"/>
+          <wp:inline distT="0" distB="0" distL="0" distR="0" wp14:anchorId="5376B59E" wp14:editId="0D689F7F">
+            <wp:extent cx="720000" cy="720000"/>
+            <wp:effectExtent l="0" t="0" r="4445" b="4445"/>
+            <wp:docPr id="333231694" name="图片 6"/>
             <wp:cNvGraphicFramePr>
               <a:graphicFrameLocks xmlns:a="http://schemas.openxmlformats.org/drawingml/2006/main" noChangeAspect="1"/>
             </wp:cNvGraphicFramePr>
@@ -513,21 +513,21 @@
                     <pic:cNvPicPr/>
                   </pic:nvPicPr>
                   <pic:blipFill>
-                    <a:blip r:embed="rId6">
-                      <a:extLst>
-                        <a:ext uri="{28A0092B-C50C-407E-A947-70E740481C1C}">
-                          <a14:useLocalDpi xmlns:a14="http://schemas.microsoft.com/office/drawing/2010/main" val="0"/>
-                        </a:ext>
-                      </a:extLst>
-                    </a:blip>
-                    <a:stretch>
-                      <a:fillRect/>
-                    </a:stretch>
-                  </pic:blipFill>
-                  <pic:spPr>
-                    <a:xfrm>
-                      <a:off x="0" y="0"/>
-                      <a:ext cx="1080000" cy="1080000"/>
+                    <a:blip r:embed="rId6" cstate="print">
+                      <a:extLst>
+                        <a:ext uri="{28A0092B-C50C-407E-A947-70E740481C1C}">
+                          <a14:useLocalDpi xmlns:a14="http://schemas.microsoft.com/office/drawing/2010/main" val="0"/>
+                        </a:ext>
+                      </a:extLst>
+                    </a:blip>
+                    <a:stretch>
+                      <a:fillRect/>
+                    </a:stretch>
+                  </pic:blipFill>
+                  <pic:spPr>
+                    <a:xfrm>
+                      <a:off x="0" y="0"/>
+                      <a:ext cx="720000" cy="720000"/>
                     </a:xfrm>
                     <a:prstGeom prst="rect">
                       <a:avLst/>
@@ -547,10 +547,10 @@
           <w:noProof/>
         </w:rPr>
         <w:drawing>
-          <wp:inline distT="0" distB="0" distL="0" distR="0" wp14:anchorId="64874DA2" wp14:editId="35BA2AA0">
-            <wp:extent cx="1080000" cy="1080000"/>
-            <wp:effectExtent l="0" t="0" r="0" b="0"/>
-            <wp:docPr id="2090869668" name="图片 7"/>
+          <wp:inline distT="0" distB="0" distL="0" distR="0" wp14:anchorId="199EE4D1" wp14:editId="79F37F53">
+            <wp:extent cx="720000" cy="720000"/>
+            <wp:effectExtent l="0" t="0" r="4445" b="4445"/>
+            <wp:docPr id="900703052" name="图片 7"/>
             <wp:cNvGraphicFramePr>
               <a:graphicFrameLocks xmlns:a="http://schemas.openxmlformats.org/drawingml/2006/main" noChangeAspect="1"/>
             </wp:cNvGraphicFramePr>
@@ -562,21 +562,21 @@
                     <pic:cNvPicPr/>
                   </pic:nvPicPr>
                   <pic:blipFill>
-                    <a:blip r:embed="rId7">
-                      <a:extLst>
-                        <a:ext uri="{28A0092B-C50C-407E-A947-70E740481C1C}">
-                          <a14:useLocalDpi xmlns:a14="http://schemas.microsoft.com/office/drawing/2010/main" val="0"/>
-                        </a:ext>
-                      </a:extLst>
-                    </a:blip>
-                    <a:stretch>
-                      <a:fillRect/>
-                    </a:stretch>
-                  </pic:blipFill>
-                  <pic:spPr>
-                    <a:xfrm>
-                      <a:off x="0" y="0"/>
-                      <a:ext cx="1080000" cy="1080000"/>
+                    <a:blip r:embed="rId7" cstate="print">
+                      <a:extLst>
+                        <a:ext uri="{28A0092B-C50C-407E-A947-70E740481C1C}">
+                          <a14:useLocalDpi xmlns:a14="http://schemas.microsoft.com/office/drawing/2010/main" val="0"/>
+                        </a:ext>
+                      </a:extLst>
+                    </a:blip>
+                    <a:stretch>
+                      <a:fillRect/>
+                    </a:stretch>
+                  </pic:blipFill>
+                  <pic:spPr>
+                    <a:xfrm>
+                      <a:off x="0" y="0"/>
+                      <a:ext cx="720000" cy="720000"/>
                     </a:xfrm>
                     <a:prstGeom prst="rect">
                       <a:avLst/>
@@ -596,10 +596,10 @@
           <w:noProof/>
         </w:rPr>
         <w:drawing>
-          <wp:inline distT="0" distB="0" distL="0" distR="0" wp14:anchorId="7860C02C" wp14:editId="32B9405C">
-            <wp:extent cx="1080000" cy="1080000"/>
-            <wp:effectExtent l="0" t="0" r="0" b="0"/>
-            <wp:docPr id="134532123" name="图片 1"/>
+          <wp:inline distT="0" distB="0" distL="0" distR="0" wp14:anchorId="632E1DDC" wp14:editId="7FB265AC">
+            <wp:extent cx="720000" cy="720000"/>
+            <wp:effectExtent l="0" t="0" r="4445" b="4445"/>
+            <wp:docPr id="1873929339" name="图片 1"/>
             <wp:cNvGraphicFramePr>
               <a:graphicFrameLocks xmlns:a="http://schemas.openxmlformats.org/drawingml/2006/main" noChangeAspect="1"/>
             </wp:cNvGraphicFramePr>
@@ -611,21 +611,21 @@
                     <pic:cNvPicPr/>
                   </pic:nvPicPr>
                   <pic:blipFill>
-                    <a:blip r:embed="rId4">
-                      <a:extLst>
-                        <a:ext uri="{28A0092B-C50C-407E-A947-70E740481C1C}">
-                          <a14:useLocalDpi xmlns:a14="http://schemas.microsoft.com/office/drawing/2010/main" val="0"/>
-                        </a:ext>
-                      </a:extLst>
-                    </a:blip>
-                    <a:stretch>
-                      <a:fillRect/>
-                    </a:stretch>
-                  </pic:blipFill>
-                  <pic:spPr>
-                    <a:xfrm>
-                      <a:off x="0" y="0"/>
-                      <a:ext cx="1080000" cy="1080000"/>
+                    <a:blip r:embed="rId4" cstate="print">
+                      <a:extLst>
+                        <a:ext uri="{28A0092B-C50C-407E-A947-70E740481C1C}">
+                          <a14:useLocalDpi xmlns:a14="http://schemas.microsoft.com/office/drawing/2010/main" val="0"/>
+                        </a:ext>
+                      </a:extLst>
+                    </a:blip>
+                    <a:stretch>
+                      <a:fillRect/>
+                    </a:stretch>
+                  </pic:blipFill>
+                  <pic:spPr>
+                    <a:xfrm>
+                      <a:off x="0" y="0"/>
+                      <a:ext cx="720000" cy="720000"/>
                     </a:xfrm>
                     <a:prstGeom prst="rect">
                       <a:avLst/>
@@ -645,10 +645,10 @@
           <w:noProof/>
         </w:rPr>
         <w:drawing>
-          <wp:inline distT="0" distB="0" distL="0" distR="0" wp14:anchorId="07E6E450" wp14:editId="3FD19134">
-            <wp:extent cx="1080000" cy="1080000"/>
-            <wp:effectExtent l="0" t="0" r="0" b="0"/>
-            <wp:docPr id="518932037" name="图片 5"/>
+          <wp:inline distT="0" distB="0" distL="0" distR="0" wp14:anchorId="592A31B4" wp14:editId="78AC291E">
+            <wp:extent cx="720000" cy="720000"/>
+            <wp:effectExtent l="0" t="0" r="4445" b="4445"/>
+            <wp:docPr id="1604677825" name="图片 5"/>
             <wp:cNvGraphicFramePr>
               <a:graphicFrameLocks xmlns:a="http://schemas.openxmlformats.org/drawingml/2006/main" noChangeAspect="1"/>
             </wp:cNvGraphicFramePr>
@@ -660,21 +660,21 @@
                     <pic:cNvPicPr/>
                   </pic:nvPicPr>
                   <pic:blipFill>
-                    <a:blip r:embed="rId5">
-                      <a:extLst>
-                        <a:ext uri="{28A0092B-C50C-407E-A947-70E740481C1C}">
-                          <a14:useLocalDpi xmlns:a14="http://schemas.microsoft.com/office/drawing/2010/main" val="0"/>
-                        </a:ext>
-                      </a:extLst>
-                    </a:blip>
-                    <a:stretch>
-                      <a:fillRect/>
-                    </a:stretch>
-                  </pic:blipFill>
-                  <pic:spPr>
-                    <a:xfrm>
-                      <a:off x="0" y="0"/>
-                      <a:ext cx="1080000" cy="1080000"/>
+                    <a:blip r:embed="rId5" cstate="print">
+                      <a:extLst>
+                        <a:ext uri="{28A0092B-C50C-407E-A947-70E740481C1C}">
+                          <a14:useLocalDpi xmlns:a14="http://schemas.microsoft.com/office/drawing/2010/main" val="0"/>
+                        </a:ext>
+                      </a:extLst>
+                    </a:blip>
+                    <a:stretch>
+                      <a:fillRect/>
+                    </a:stretch>
+                  </pic:blipFill>
+                  <pic:spPr>
+                    <a:xfrm>
+                      <a:off x="0" y="0"/>
+                      <a:ext cx="720000" cy="720000"/>
                     </a:xfrm>
                     <a:prstGeom prst="rect">
                       <a:avLst/>
@@ -694,10 +694,10 @@
           <w:noProof/>
         </w:rPr>
         <w:drawing>
-          <wp:inline distT="0" distB="0" distL="0" distR="0" wp14:anchorId="65BC3DF2" wp14:editId="01A166C0">
-            <wp:extent cx="1080000" cy="1080000"/>
-            <wp:effectExtent l="0" t="0" r="0" b="0"/>
-            <wp:docPr id="223353422" name="图片 6"/>
+          <wp:inline distT="0" distB="0" distL="0" distR="0" wp14:anchorId="1BAAEC66" wp14:editId="027C6144">
+            <wp:extent cx="720000" cy="720000"/>
+            <wp:effectExtent l="0" t="0" r="4445" b="4445"/>
+            <wp:docPr id="751755052" name="图片 6"/>
             <wp:cNvGraphicFramePr>
               <a:graphicFrameLocks xmlns:a="http://schemas.openxmlformats.org/drawingml/2006/main" noChangeAspect="1"/>
             </wp:cNvGraphicFramePr>
@@ -709,21 +709,21 @@
                     <pic:cNvPicPr/>
                   </pic:nvPicPr>
                   <pic:blipFill>
-                    <a:blip r:embed="rId6">
-                      <a:extLst>
-                        <a:ext uri="{28A0092B-C50C-407E-A947-70E740481C1C}">
-                          <a14:useLocalDpi xmlns:a14="http://schemas.microsoft.com/office/drawing/2010/main" val="0"/>
-                        </a:ext>
-                      </a:extLst>
-                    </a:blip>
-                    <a:stretch>
-                      <a:fillRect/>
-                    </a:stretch>
-                  </pic:blipFill>
-                  <pic:spPr>
-                    <a:xfrm>
-                      <a:off x="0" y="0"/>
-                      <a:ext cx="1080000" cy="1080000"/>
+                    <a:blip r:embed="rId6" cstate="print">
+                      <a:extLst>
+                        <a:ext uri="{28A0092B-C50C-407E-A947-70E740481C1C}">
+                          <a14:useLocalDpi xmlns:a14="http://schemas.microsoft.com/office/drawing/2010/main" val="0"/>
+                        </a:ext>
+                      </a:extLst>
+                    </a:blip>
+                    <a:stretch>
+                      <a:fillRect/>
+                    </a:stretch>
+                  </pic:blipFill>
+                  <pic:spPr>
+                    <a:xfrm>
+                      <a:off x="0" y="0"/>
+                      <a:ext cx="720000" cy="720000"/>
                     </a:xfrm>
                     <a:prstGeom prst="rect">
                       <a:avLst/>
@@ -743,10 +743,10 @@
           <w:noProof/>
         </w:rPr>
         <w:drawing>
-          <wp:inline distT="0" distB="0" distL="0" distR="0" wp14:anchorId="27EF9491" wp14:editId="2D2336BA">
-            <wp:extent cx="1080000" cy="1080000"/>
-            <wp:effectExtent l="0" t="0" r="0" b="0"/>
-            <wp:docPr id="1017839498" name="图片 7"/>
+          <wp:inline distT="0" distB="0" distL="0" distR="0" wp14:anchorId="19F201C5" wp14:editId="57CA2F10">
+            <wp:extent cx="720000" cy="720000"/>
+            <wp:effectExtent l="0" t="0" r="4445" b="4445"/>
+            <wp:docPr id="1712206194" name="图片 7"/>
             <wp:cNvGraphicFramePr>
               <a:graphicFrameLocks xmlns:a="http://schemas.openxmlformats.org/drawingml/2006/main" noChangeAspect="1"/>
             </wp:cNvGraphicFramePr>
@@ -758,21 +758,21 @@
                     <pic:cNvPicPr/>
                   </pic:nvPicPr>
                   <pic:blipFill>
-                    <a:blip r:embed="rId7">
-                      <a:extLst>
-                        <a:ext uri="{28A0092B-C50C-407E-A947-70E740481C1C}">
-                          <a14:useLocalDpi xmlns:a14="http://schemas.microsoft.com/office/drawing/2010/main" val="0"/>
-                        </a:ext>
-                      </a:extLst>
-                    </a:blip>
-                    <a:stretch>
-                      <a:fillRect/>
-                    </a:stretch>
-                  </pic:blipFill>
-                  <pic:spPr>
-                    <a:xfrm>
-                      <a:off x="0" y="0"/>
-                      <a:ext cx="1080000" cy="1080000"/>
+                    <a:blip r:embed="rId7" cstate="print">
+                      <a:extLst>
+                        <a:ext uri="{28A0092B-C50C-407E-A947-70E740481C1C}">
+                          <a14:useLocalDpi xmlns:a14="http://schemas.microsoft.com/office/drawing/2010/main" val="0"/>
+                        </a:ext>
+                      </a:extLst>
+                    </a:blip>
+                    <a:stretch>
+                      <a:fillRect/>
+                    </a:stretch>
+                  </pic:blipFill>
+                  <pic:spPr>
+                    <a:xfrm>
+                      <a:off x="0" y="0"/>
+                      <a:ext cx="720000" cy="720000"/>
                     </a:xfrm>
                     <a:prstGeom prst="rect">
                       <a:avLst/>
@@ -792,10 +792,10 @@
           <w:noProof/>
         </w:rPr>
         <w:drawing>
-          <wp:inline distT="0" distB="0" distL="0" distR="0" wp14:anchorId="3AF73774" wp14:editId="39172FF9">
-            <wp:extent cx="1080000" cy="1080000"/>
-            <wp:effectExtent l="0" t="0" r="0" b="0"/>
-            <wp:docPr id="1827033552" name="图片 1"/>
+          <wp:inline distT="0" distB="0" distL="0" distR="0" wp14:anchorId="431498A6" wp14:editId="37ABE057">
+            <wp:extent cx="720000" cy="720000"/>
+            <wp:effectExtent l="0" t="0" r="4445" b="4445"/>
+            <wp:docPr id="1111431187" name="图片 1"/>
             <wp:cNvGraphicFramePr>
               <a:graphicFrameLocks xmlns:a="http://schemas.openxmlformats.org/drawingml/2006/main" noChangeAspect="1"/>
             </wp:cNvGraphicFramePr>
@@ -807,21 +807,21 @@
                     <pic:cNvPicPr/>
                   </pic:nvPicPr>
                   <pic:blipFill>
-                    <a:blip r:embed="rId4">
-                      <a:extLst>
-                        <a:ext uri="{28A0092B-C50C-407E-A947-70E740481C1C}">
-                          <a14:useLocalDpi xmlns:a14="http://schemas.microsoft.com/office/drawing/2010/main" val="0"/>
-                        </a:ext>
-                      </a:extLst>
-                    </a:blip>
-                    <a:stretch>
-                      <a:fillRect/>
-                    </a:stretch>
-                  </pic:blipFill>
-                  <pic:spPr>
-                    <a:xfrm>
-                      <a:off x="0" y="0"/>
-                      <a:ext cx="1080000" cy="1080000"/>
+                    <a:blip r:embed="rId4" cstate="print">
+                      <a:extLst>
+                        <a:ext uri="{28A0092B-C50C-407E-A947-70E740481C1C}">
+                          <a14:useLocalDpi xmlns:a14="http://schemas.microsoft.com/office/drawing/2010/main" val="0"/>
+                        </a:ext>
+                      </a:extLst>
+                    </a:blip>
+                    <a:stretch>
+                      <a:fillRect/>
+                    </a:stretch>
+                  </pic:blipFill>
+                  <pic:spPr>
+                    <a:xfrm>
+                      <a:off x="0" y="0"/>
+                      <a:ext cx="720000" cy="720000"/>
                     </a:xfrm>
                     <a:prstGeom prst="rect">
                       <a:avLst/>
@@ -841,10 +841,10 @@
           <w:noProof/>
         </w:rPr>
         <w:drawing>
-          <wp:inline distT="0" distB="0" distL="0" distR="0" wp14:anchorId="499848FC" wp14:editId="7234CA1B">
-            <wp:extent cx="1080000" cy="1080000"/>
-            <wp:effectExtent l="0" t="0" r="0" b="0"/>
-            <wp:docPr id="1975143264" name="图片 5"/>
+          <wp:inline distT="0" distB="0" distL="0" distR="0" wp14:anchorId="596CFF9C" wp14:editId="7F995056">
+            <wp:extent cx="720000" cy="720000"/>
+            <wp:effectExtent l="0" t="0" r="4445" b="4445"/>
+            <wp:docPr id="1486127978" name="图片 5"/>
             <wp:cNvGraphicFramePr>
               <a:graphicFrameLocks xmlns:a="http://schemas.openxmlformats.org/drawingml/2006/main" noChangeAspect="1"/>
             </wp:cNvGraphicFramePr>
@@ -856,21 +856,21 @@
                     <pic:cNvPicPr/>
                   </pic:nvPicPr>
                   <pic:blipFill>
-                    <a:blip r:embed="rId5">
-                      <a:extLst>
-                        <a:ext uri="{28A0092B-C50C-407E-A947-70E740481C1C}">
-                          <a14:useLocalDpi xmlns:a14="http://schemas.microsoft.com/office/drawing/2010/main" val="0"/>
-                        </a:ext>
-                      </a:extLst>
-                    </a:blip>
-                    <a:stretch>
-                      <a:fillRect/>
-                    </a:stretch>
-                  </pic:blipFill>
-                  <pic:spPr>
-                    <a:xfrm>
-                      <a:off x="0" y="0"/>
-                      <a:ext cx="1080000" cy="1080000"/>
+                    <a:blip r:embed="rId5" cstate="print">
+                      <a:extLst>
+                        <a:ext uri="{28A0092B-C50C-407E-A947-70E740481C1C}">
+                          <a14:useLocalDpi xmlns:a14="http://schemas.microsoft.com/office/drawing/2010/main" val="0"/>
+                        </a:ext>
+                      </a:extLst>
+                    </a:blip>
+                    <a:stretch>
+                      <a:fillRect/>
+                    </a:stretch>
+                  </pic:blipFill>
+                  <pic:spPr>
+                    <a:xfrm>
+                      <a:off x="0" y="0"/>
+                      <a:ext cx="720000" cy="720000"/>
                     </a:xfrm>
                     <a:prstGeom prst="rect">
                       <a:avLst/>
@@ -890,10 +890,10 @@
           <w:noProof/>
         </w:rPr>
         <w:drawing>
-          <wp:inline distT="0" distB="0" distL="0" distR="0" wp14:anchorId="6E3A507D" wp14:editId="4E2EADCA">
-            <wp:extent cx="1080000" cy="1080000"/>
-            <wp:effectExtent l="0" t="0" r="0" b="0"/>
-            <wp:docPr id="139459555" name="图片 6"/>
+          <wp:inline distT="0" distB="0" distL="0" distR="0" wp14:anchorId="4C180A15" wp14:editId="154E8036">
+            <wp:extent cx="720000" cy="720000"/>
+            <wp:effectExtent l="0" t="0" r="4445" b="4445"/>
+            <wp:docPr id="1490275651" name="图片 6"/>
             <wp:cNvGraphicFramePr>
               <a:graphicFrameLocks xmlns:a="http://schemas.openxmlformats.org/drawingml/2006/main" noChangeAspect="1"/>
             </wp:cNvGraphicFramePr>
@@ -905,21 +905,21 @@
                     <pic:cNvPicPr/>
                   </pic:nvPicPr>
                   <pic:blipFill>
-                    <a:blip r:embed="rId6">
-                      <a:extLst>
-                        <a:ext uri="{28A0092B-C50C-407E-A947-70E740481C1C}">
-                          <a14:useLocalDpi xmlns:a14="http://schemas.microsoft.com/office/drawing/2010/main" val="0"/>
-                        </a:ext>
-                      </a:extLst>
-                    </a:blip>
-                    <a:stretch>
-                      <a:fillRect/>
-                    </a:stretch>
-                  </pic:blipFill>
-                  <pic:spPr>
-                    <a:xfrm>
-                      <a:off x="0" y="0"/>
-                      <a:ext cx="1080000" cy="1080000"/>
+                    <a:blip r:embed="rId6" cstate="print">
+                      <a:extLst>
+                        <a:ext uri="{28A0092B-C50C-407E-A947-70E740481C1C}">
+                          <a14:useLocalDpi xmlns:a14="http://schemas.microsoft.com/office/drawing/2010/main" val="0"/>
+                        </a:ext>
+                      </a:extLst>
+                    </a:blip>
+                    <a:stretch>
+                      <a:fillRect/>
+                    </a:stretch>
+                  </pic:blipFill>
+                  <pic:spPr>
+                    <a:xfrm>
+                      <a:off x="0" y="0"/>
+                      <a:ext cx="720000" cy="720000"/>
                     </a:xfrm>
                     <a:prstGeom prst="rect">
                       <a:avLst/>
@@ -939,10 +939,10 @@
           <w:noProof/>
         </w:rPr>
         <w:drawing>
-          <wp:inline distT="0" distB="0" distL="0" distR="0" wp14:anchorId="6FCE0B40" wp14:editId="4E929388">
-            <wp:extent cx="1080000" cy="1080000"/>
-            <wp:effectExtent l="0" t="0" r="0" b="0"/>
-            <wp:docPr id="187352056" name="图片 7"/>
+          <wp:inline distT="0" distB="0" distL="0" distR="0" wp14:anchorId="45D075D5" wp14:editId="7664D50E">
+            <wp:extent cx="720000" cy="720000"/>
+            <wp:effectExtent l="0" t="0" r="4445" b="4445"/>
+            <wp:docPr id="1637317655" name="图片 7"/>
             <wp:cNvGraphicFramePr>
               <a:graphicFrameLocks xmlns:a="http://schemas.openxmlformats.org/drawingml/2006/main" noChangeAspect="1"/>
             </wp:cNvGraphicFramePr>
@@ -954,21 +954,21 @@
                     <pic:cNvPicPr/>
                   </pic:nvPicPr>
                   <pic:blipFill>
-                    <a:blip r:embed="rId7">
-                      <a:extLst>
-                        <a:ext uri="{28A0092B-C50C-407E-A947-70E740481C1C}">
-                          <a14:useLocalDpi xmlns:a14="http://schemas.microsoft.com/office/drawing/2010/main" val="0"/>
-                        </a:ext>
-                      </a:extLst>
-                    </a:blip>
-                    <a:stretch>
-                      <a:fillRect/>
-                    </a:stretch>
-                  </pic:blipFill>
-                  <pic:spPr>
-                    <a:xfrm>
-                      <a:off x="0" y="0"/>
-                      <a:ext cx="1080000" cy="1080000"/>
+                    <a:blip r:embed="rId7" cstate="print">
+                      <a:extLst>
+                        <a:ext uri="{28A0092B-C50C-407E-A947-70E740481C1C}">
+                          <a14:useLocalDpi xmlns:a14="http://schemas.microsoft.com/office/drawing/2010/main" val="0"/>
+                        </a:ext>
+                      </a:extLst>
+                    </a:blip>
+                    <a:stretch>
+                      <a:fillRect/>
+                    </a:stretch>
+                  </pic:blipFill>
+                  <pic:spPr>
+                    <a:xfrm>
+                      <a:off x="0" y="0"/>
+                      <a:ext cx="720000" cy="720000"/>
                     </a:xfrm>
                     <a:prstGeom prst="rect">
                       <a:avLst/>
@@ -988,10 +988,10 @@
           <w:noProof/>
         </w:rPr>
         <w:drawing>
-          <wp:inline distT="0" distB="0" distL="0" distR="0" wp14:anchorId="683296DB" wp14:editId="77D23037">
-            <wp:extent cx="1080000" cy="1080000"/>
-            <wp:effectExtent l="0" t="0" r="0" b="0"/>
-            <wp:docPr id="1045934915" name="图片 1"/>
+          <wp:inline distT="0" distB="0" distL="0" distR="0" wp14:anchorId="4929E55E" wp14:editId="2617B418">
+            <wp:extent cx="720000" cy="720000"/>
+            <wp:effectExtent l="0" t="0" r="4445" b="4445"/>
+            <wp:docPr id="820244299" name="图片 1"/>
             <wp:cNvGraphicFramePr>
               <a:graphicFrameLocks xmlns:a="http://schemas.openxmlformats.org/drawingml/2006/main" noChangeAspect="1"/>
             </wp:cNvGraphicFramePr>
@@ -1003,21 +1003,21 @@
                     <pic:cNvPicPr/>
                   </pic:nvPicPr>
                   <pic:blipFill>
-                    <a:blip r:embed="rId4">
-                      <a:extLst>
-                        <a:ext uri="{28A0092B-C50C-407E-A947-70E740481C1C}">
-                          <a14:useLocalDpi xmlns:a14="http://schemas.microsoft.com/office/drawing/2010/main" val="0"/>
-                        </a:ext>
-                      </a:extLst>
-                    </a:blip>
-                    <a:stretch>
-                      <a:fillRect/>
-                    </a:stretch>
-                  </pic:blipFill>
-                  <pic:spPr>
-                    <a:xfrm>
-                      <a:off x="0" y="0"/>
-                      <a:ext cx="1080000" cy="1080000"/>
+                    <a:blip r:embed="rId4" cstate="print">
+                      <a:extLst>
+                        <a:ext uri="{28A0092B-C50C-407E-A947-70E740481C1C}">
+                          <a14:useLocalDpi xmlns:a14="http://schemas.microsoft.com/office/drawing/2010/main" val="0"/>
+                        </a:ext>
+                      </a:extLst>
+                    </a:blip>
+                    <a:stretch>
+                      <a:fillRect/>
+                    </a:stretch>
+                  </pic:blipFill>
+                  <pic:spPr>
+                    <a:xfrm>
+                      <a:off x="0" y="0"/>
+                      <a:ext cx="720000" cy="720000"/>
                     </a:xfrm>
                     <a:prstGeom prst="rect">
                       <a:avLst/>
@@ -1037,10 +1037,10 @@
           <w:noProof/>
         </w:rPr>
         <w:drawing>
-          <wp:inline distT="0" distB="0" distL="0" distR="0" wp14:anchorId="559093F5" wp14:editId="26890016">
-            <wp:extent cx="1080000" cy="1080000"/>
-            <wp:effectExtent l="0" t="0" r="0" b="0"/>
-            <wp:docPr id="2065012042" name="图片 5"/>
+          <wp:inline distT="0" distB="0" distL="0" distR="0" wp14:anchorId="306264F4" wp14:editId="6C58CF5B">
+            <wp:extent cx="720000" cy="720000"/>
+            <wp:effectExtent l="0" t="0" r="4445" b="4445"/>
+            <wp:docPr id="1082701218" name="图片 5"/>
             <wp:cNvGraphicFramePr>
               <a:graphicFrameLocks xmlns:a="http://schemas.openxmlformats.org/drawingml/2006/main" noChangeAspect="1"/>
             </wp:cNvGraphicFramePr>
@@ -1052,21 +1052,21 @@
                     <pic:cNvPicPr/>
                   </pic:nvPicPr>
                   <pic:blipFill>
-                    <a:blip r:embed="rId5">
-                      <a:extLst>
-                        <a:ext uri="{28A0092B-C50C-407E-A947-70E740481C1C}">
-                          <a14:useLocalDpi xmlns:a14="http://schemas.microsoft.com/office/drawing/2010/main" val="0"/>
-                        </a:ext>
-                      </a:extLst>
-                    </a:blip>
-                    <a:stretch>
-                      <a:fillRect/>
-                    </a:stretch>
-                  </pic:blipFill>
-                  <pic:spPr>
-                    <a:xfrm>
-                      <a:off x="0" y="0"/>
-                      <a:ext cx="1080000" cy="1080000"/>
+                    <a:blip r:embed="rId5" cstate="print">
+                      <a:extLst>
+                        <a:ext uri="{28A0092B-C50C-407E-A947-70E740481C1C}">
+                          <a14:useLocalDpi xmlns:a14="http://schemas.microsoft.com/office/drawing/2010/main" val="0"/>
+                        </a:ext>
+                      </a:extLst>
+                    </a:blip>
+                    <a:stretch>
+                      <a:fillRect/>
+                    </a:stretch>
+                  </pic:blipFill>
+                  <pic:spPr>
+                    <a:xfrm>
+                      <a:off x="0" y="0"/>
+                      <a:ext cx="720000" cy="720000"/>
                     </a:xfrm>
                     <a:prstGeom prst="rect">
                       <a:avLst/>
@@ -1086,10 +1086,10 @@
           <w:noProof/>
         </w:rPr>
         <w:drawing>
-          <wp:inline distT="0" distB="0" distL="0" distR="0" wp14:anchorId="70D51CE9" wp14:editId="3AC31D71">
-            <wp:extent cx="1080000" cy="1080000"/>
-            <wp:effectExtent l="0" t="0" r="0" b="0"/>
-            <wp:docPr id="1398961439" name="图片 6"/>
+          <wp:inline distT="0" distB="0" distL="0" distR="0" wp14:anchorId="0A3A5C07" wp14:editId="7C87446C">
+            <wp:extent cx="720000" cy="720000"/>
+            <wp:effectExtent l="0" t="0" r="4445" b="4445"/>
+            <wp:docPr id="1657132935" name="图片 6"/>
             <wp:cNvGraphicFramePr>
               <a:graphicFrameLocks xmlns:a="http://schemas.openxmlformats.org/drawingml/2006/main" noChangeAspect="1"/>
             </wp:cNvGraphicFramePr>
@@ -1101,21 +1101,21 @@
                     <pic:cNvPicPr/>
                   </pic:nvPicPr>
                   <pic:blipFill>
-                    <a:blip r:embed="rId6">
-                      <a:extLst>
-                        <a:ext uri="{28A0092B-C50C-407E-A947-70E740481C1C}">
-                          <a14:useLocalDpi xmlns:a14="http://schemas.microsoft.com/office/drawing/2010/main" val="0"/>
-                        </a:ext>
-                      </a:extLst>
-                    </a:blip>
-                    <a:stretch>
-                      <a:fillRect/>
-                    </a:stretch>
-                  </pic:blipFill>
-                  <pic:spPr>
-                    <a:xfrm>
-                      <a:off x="0" y="0"/>
-                      <a:ext cx="1080000" cy="1080000"/>
+                    <a:blip r:embed="rId6" cstate="print">
+                      <a:extLst>
+                        <a:ext uri="{28A0092B-C50C-407E-A947-70E740481C1C}">
+                          <a14:useLocalDpi xmlns:a14="http://schemas.microsoft.com/office/drawing/2010/main" val="0"/>
+                        </a:ext>
+                      </a:extLst>
+                    </a:blip>
+                    <a:stretch>
+                      <a:fillRect/>
+                    </a:stretch>
+                  </pic:blipFill>
+                  <pic:spPr>
+                    <a:xfrm>
+                      <a:off x="0" y="0"/>
+                      <a:ext cx="720000" cy="720000"/>
                     </a:xfrm>
                     <a:prstGeom prst="rect">
                       <a:avLst/>
@@ -1135,10 +1135,10 @@
           <w:noProof/>
         </w:rPr>
         <w:drawing>
-          <wp:inline distT="0" distB="0" distL="0" distR="0" wp14:anchorId="6A4D4932" wp14:editId="31FDF881">
-            <wp:extent cx="1080000" cy="1080000"/>
-            <wp:effectExtent l="0" t="0" r="0" b="0"/>
-            <wp:docPr id="229166903" name="图片 7"/>
+          <wp:inline distT="0" distB="0" distL="0" distR="0" wp14:anchorId="3E8F07DB" wp14:editId="70F4DB20">
+            <wp:extent cx="720000" cy="720000"/>
+            <wp:effectExtent l="0" t="0" r="4445" b="4445"/>
+            <wp:docPr id="1928052533" name="图片 7"/>
             <wp:cNvGraphicFramePr>
               <a:graphicFrameLocks xmlns:a="http://schemas.openxmlformats.org/drawingml/2006/main" noChangeAspect="1"/>
             </wp:cNvGraphicFramePr>
@@ -1150,21 +1150,609 @@
                     <pic:cNvPicPr/>
                   </pic:nvPicPr>
                   <pic:blipFill>
-                    <a:blip r:embed="rId7">
-                      <a:extLst>
-                        <a:ext uri="{28A0092B-C50C-407E-A947-70E740481C1C}">
-                          <a14:useLocalDpi xmlns:a14="http://schemas.microsoft.com/office/drawing/2010/main" val="0"/>
-                        </a:ext>
-                      </a:extLst>
-                    </a:blip>
-                    <a:stretch>
-                      <a:fillRect/>
-                    </a:stretch>
-                  </pic:blipFill>
-                  <pic:spPr>
-                    <a:xfrm>
-                      <a:off x="0" y="0"/>
-                      <a:ext cx="1080000" cy="1080000"/>
+                    <a:blip r:embed="rId7" cstate="print">
+                      <a:extLst>
+                        <a:ext uri="{28A0092B-C50C-407E-A947-70E740481C1C}">
+                          <a14:useLocalDpi xmlns:a14="http://schemas.microsoft.com/office/drawing/2010/main" val="0"/>
+                        </a:ext>
+                      </a:extLst>
+                    </a:blip>
+                    <a:stretch>
+                      <a:fillRect/>
+                    </a:stretch>
+                  </pic:blipFill>
+                  <pic:spPr>
+                    <a:xfrm>
+                      <a:off x="0" y="0"/>
+                      <a:ext cx="720000" cy="720000"/>
+                    </a:xfrm>
+                    <a:prstGeom prst="rect">
+                      <a:avLst/>
+                    </a:prstGeom>
+                  </pic:spPr>
+                </pic:pic>
+              </a:graphicData>
+            </a:graphic>
+          </wp:inline>
+        </w:drawing>
+      </w:r>
+    </w:p>
+    <w:p/>
+    <w:p>
+      <w:r>
+        <w:rPr>
+          <w:noProof/>
+        </w:rPr>
+        <w:drawing>
+          <wp:inline distT="0" distB="0" distL="0" distR="0" wp14:anchorId="032CA90E" wp14:editId="070F4C75">
+            <wp:extent cx="720000" cy="720000"/>
+            <wp:effectExtent l="0" t="0" r="4445" b="4445"/>
+            <wp:docPr id="720650841" name="图片 1"/>
+            <wp:cNvGraphicFramePr>
+              <a:graphicFrameLocks xmlns:a="http://schemas.openxmlformats.org/drawingml/2006/main" noChangeAspect="1"/>
+            </wp:cNvGraphicFramePr>
+            <a:graphic xmlns:a="http://schemas.openxmlformats.org/drawingml/2006/main">
+              <a:graphicData uri="http://schemas.openxmlformats.org/drawingml/2006/picture">
+                <pic:pic xmlns:pic="http://schemas.openxmlformats.org/drawingml/2006/picture">
+                  <pic:nvPicPr>
+                    <pic:cNvPr id="1524649862" name="图片 1524649862"/>
+                    <pic:cNvPicPr/>
+                  </pic:nvPicPr>
+                  <pic:blipFill>
+                    <a:blip r:embed="rId4" cstate="print">
+                      <a:extLst>
+                        <a:ext uri="{28A0092B-C50C-407E-A947-70E740481C1C}">
+                          <a14:useLocalDpi xmlns:a14="http://schemas.microsoft.com/office/drawing/2010/main" val="0"/>
+                        </a:ext>
+                      </a:extLst>
+                    </a:blip>
+                    <a:stretch>
+                      <a:fillRect/>
+                    </a:stretch>
+                  </pic:blipFill>
+                  <pic:spPr>
+                    <a:xfrm>
+                      <a:off x="0" y="0"/>
+                      <a:ext cx="720000" cy="720000"/>
+                    </a:xfrm>
+                    <a:prstGeom prst="rect">
+                      <a:avLst/>
+                    </a:prstGeom>
+                  </pic:spPr>
+                </pic:pic>
+              </a:graphicData>
+            </a:graphic>
+          </wp:inline>
+        </w:drawing>
+      </w:r>
+      <w:r>
+        <w:t xml:space="preserve">    </w:t>
+      </w:r>
+      <w:r>
+        <w:rPr>
+          <w:noProof/>
+        </w:rPr>
+        <w:drawing>
+          <wp:inline distT="0" distB="0" distL="0" distR="0" wp14:anchorId="2E3EA2E5" wp14:editId="5C035636">
+            <wp:extent cx="720000" cy="720000"/>
+            <wp:effectExtent l="0" t="0" r="4445" b="4445"/>
+            <wp:docPr id="1663091795" name="图片 5"/>
+            <wp:cNvGraphicFramePr>
+              <a:graphicFrameLocks xmlns:a="http://schemas.openxmlformats.org/drawingml/2006/main" noChangeAspect="1"/>
+            </wp:cNvGraphicFramePr>
+            <a:graphic xmlns:a="http://schemas.openxmlformats.org/drawingml/2006/main">
+              <a:graphicData uri="http://schemas.openxmlformats.org/drawingml/2006/picture">
+                <pic:pic xmlns:pic="http://schemas.openxmlformats.org/drawingml/2006/picture">
+                  <pic:nvPicPr>
+                    <pic:cNvPr id="1371579297" name="图片 1371579297"/>
+                    <pic:cNvPicPr/>
+                  </pic:nvPicPr>
+                  <pic:blipFill>
+                    <a:blip r:embed="rId5" cstate="print">
+                      <a:extLst>
+                        <a:ext uri="{28A0092B-C50C-407E-A947-70E740481C1C}">
+                          <a14:useLocalDpi xmlns:a14="http://schemas.microsoft.com/office/drawing/2010/main" val="0"/>
+                        </a:ext>
+                      </a:extLst>
+                    </a:blip>
+                    <a:stretch>
+                      <a:fillRect/>
+                    </a:stretch>
+                  </pic:blipFill>
+                  <pic:spPr>
+                    <a:xfrm>
+                      <a:off x="0" y="0"/>
+                      <a:ext cx="720000" cy="720000"/>
+                    </a:xfrm>
+                    <a:prstGeom prst="rect">
+                      <a:avLst/>
+                    </a:prstGeom>
+                  </pic:spPr>
+                </pic:pic>
+              </a:graphicData>
+            </a:graphic>
+          </wp:inline>
+        </w:drawing>
+      </w:r>
+      <w:r>
+        <w:t xml:space="preserve">    </w:t>
+      </w:r>
+      <w:r>
+        <w:rPr>
+          <w:noProof/>
+        </w:rPr>
+        <w:drawing>
+          <wp:inline distT="0" distB="0" distL="0" distR="0" wp14:anchorId="6534A2C4" wp14:editId="3304D8F1">
+            <wp:extent cx="720000" cy="720000"/>
+            <wp:effectExtent l="0" t="0" r="4445" b="4445"/>
+            <wp:docPr id="196705299" name="图片 6"/>
+            <wp:cNvGraphicFramePr>
+              <a:graphicFrameLocks xmlns:a="http://schemas.openxmlformats.org/drawingml/2006/main" noChangeAspect="1"/>
+            </wp:cNvGraphicFramePr>
+            <a:graphic xmlns:a="http://schemas.openxmlformats.org/drawingml/2006/main">
+              <a:graphicData uri="http://schemas.openxmlformats.org/drawingml/2006/picture">
+                <pic:pic xmlns:pic="http://schemas.openxmlformats.org/drawingml/2006/picture">
+                  <pic:nvPicPr>
+                    <pic:cNvPr id="931392833" name="图片 931392833"/>
+                    <pic:cNvPicPr/>
+                  </pic:nvPicPr>
+                  <pic:blipFill>
+                    <a:blip r:embed="rId6" cstate="print">
+                      <a:extLst>
+                        <a:ext uri="{28A0092B-C50C-407E-A947-70E740481C1C}">
+                          <a14:useLocalDpi xmlns:a14="http://schemas.microsoft.com/office/drawing/2010/main" val="0"/>
+                        </a:ext>
+                      </a:extLst>
+                    </a:blip>
+                    <a:stretch>
+                      <a:fillRect/>
+                    </a:stretch>
+                  </pic:blipFill>
+                  <pic:spPr>
+                    <a:xfrm>
+                      <a:off x="0" y="0"/>
+                      <a:ext cx="720000" cy="720000"/>
+                    </a:xfrm>
+                    <a:prstGeom prst="rect">
+                      <a:avLst/>
+                    </a:prstGeom>
+                  </pic:spPr>
+                </pic:pic>
+              </a:graphicData>
+            </a:graphic>
+          </wp:inline>
+        </w:drawing>
+      </w:r>
+      <w:r>
+        <w:t xml:space="preserve">    </w:t>
+      </w:r>
+      <w:r>
+        <w:rPr>
+          <w:noProof/>
+        </w:rPr>
+        <w:drawing>
+          <wp:inline distT="0" distB="0" distL="0" distR="0" wp14:anchorId="7337A012" wp14:editId="7D39F1F9">
+            <wp:extent cx="720000" cy="720000"/>
+            <wp:effectExtent l="0" t="0" r="4445" b="4445"/>
+            <wp:docPr id="684010889" name="图片 7"/>
+            <wp:cNvGraphicFramePr>
+              <a:graphicFrameLocks xmlns:a="http://schemas.openxmlformats.org/drawingml/2006/main" noChangeAspect="1"/>
+            </wp:cNvGraphicFramePr>
+            <a:graphic xmlns:a="http://schemas.openxmlformats.org/drawingml/2006/main">
+              <a:graphicData uri="http://schemas.openxmlformats.org/drawingml/2006/picture">
+                <pic:pic xmlns:pic="http://schemas.openxmlformats.org/drawingml/2006/picture">
+                  <pic:nvPicPr>
+                    <pic:cNvPr id="1121889337" name="图片 1121889337"/>
+                    <pic:cNvPicPr/>
+                  </pic:nvPicPr>
+                  <pic:blipFill>
+                    <a:blip r:embed="rId7" cstate="print">
+                      <a:extLst>
+                        <a:ext uri="{28A0092B-C50C-407E-A947-70E740481C1C}">
+                          <a14:useLocalDpi xmlns:a14="http://schemas.microsoft.com/office/drawing/2010/main" val="0"/>
+                        </a:ext>
+                      </a:extLst>
+                    </a:blip>
+                    <a:stretch>
+                      <a:fillRect/>
+                    </a:stretch>
+                  </pic:blipFill>
+                  <pic:spPr>
+                    <a:xfrm>
+                      <a:off x="0" y="0"/>
+                      <a:ext cx="720000" cy="720000"/>
+                    </a:xfrm>
+                    <a:prstGeom prst="rect">
+                      <a:avLst/>
+                    </a:prstGeom>
+                  </pic:spPr>
+                </pic:pic>
+              </a:graphicData>
+            </a:graphic>
+          </wp:inline>
+        </w:drawing>
+      </w:r>
+    </w:p>
+    <w:p/>
+    <w:p>
+      <w:r>
+        <w:rPr>
+          <w:noProof/>
+        </w:rPr>
+        <w:drawing>
+          <wp:inline distT="0" distB="0" distL="0" distR="0" wp14:anchorId="49D96F5B" wp14:editId="444A9B70">
+            <wp:extent cx="720000" cy="720000"/>
+            <wp:effectExtent l="0" t="0" r="4445" b="4445"/>
+            <wp:docPr id="1999477924" name="图片 1"/>
+            <wp:cNvGraphicFramePr>
+              <a:graphicFrameLocks xmlns:a="http://schemas.openxmlformats.org/drawingml/2006/main" noChangeAspect="1"/>
+            </wp:cNvGraphicFramePr>
+            <a:graphic xmlns:a="http://schemas.openxmlformats.org/drawingml/2006/main">
+              <a:graphicData uri="http://schemas.openxmlformats.org/drawingml/2006/picture">
+                <pic:pic xmlns:pic="http://schemas.openxmlformats.org/drawingml/2006/picture">
+                  <pic:nvPicPr>
+                    <pic:cNvPr id="1524649862" name="图片 1524649862"/>
+                    <pic:cNvPicPr/>
+                  </pic:nvPicPr>
+                  <pic:blipFill>
+                    <a:blip r:embed="rId4" cstate="print">
+                      <a:extLst>
+                        <a:ext uri="{28A0092B-C50C-407E-A947-70E740481C1C}">
+                          <a14:useLocalDpi xmlns:a14="http://schemas.microsoft.com/office/drawing/2010/main" val="0"/>
+                        </a:ext>
+                      </a:extLst>
+                    </a:blip>
+                    <a:stretch>
+                      <a:fillRect/>
+                    </a:stretch>
+                  </pic:blipFill>
+                  <pic:spPr>
+                    <a:xfrm>
+                      <a:off x="0" y="0"/>
+                      <a:ext cx="720000" cy="720000"/>
+                    </a:xfrm>
+                    <a:prstGeom prst="rect">
+                      <a:avLst/>
+                    </a:prstGeom>
+                  </pic:spPr>
+                </pic:pic>
+              </a:graphicData>
+            </a:graphic>
+          </wp:inline>
+        </w:drawing>
+      </w:r>
+      <w:r>
+        <w:t xml:space="preserve">    </w:t>
+      </w:r>
+      <w:r>
+        <w:rPr>
+          <w:noProof/>
+        </w:rPr>
+        <w:drawing>
+          <wp:inline distT="0" distB="0" distL="0" distR="0" wp14:anchorId="34BF294A" wp14:editId="568B97C7">
+            <wp:extent cx="720000" cy="720000"/>
+            <wp:effectExtent l="0" t="0" r="4445" b="4445"/>
+            <wp:docPr id="1868896078" name="图片 5"/>
+            <wp:cNvGraphicFramePr>
+              <a:graphicFrameLocks xmlns:a="http://schemas.openxmlformats.org/drawingml/2006/main" noChangeAspect="1"/>
+            </wp:cNvGraphicFramePr>
+            <a:graphic xmlns:a="http://schemas.openxmlformats.org/drawingml/2006/main">
+              <a:graphicData uri="http://schemas.openxmlformats.org/drawingml/2006/picture">
+                <pic:pic xmlns:pic="http://schemas.openxmlformats.org/drawingml/2006/picture">
+                  <pic:nvPicPr>
+                    <pic:cNvPr id="1371579297" name="图片 1371579297"/>
+                    <pic:cNvPicPr/>
+                  </pic:nvPicPr>
+                  <pic:blipFill>
+                    <a:blip r:embed="rId5" cstate="print">
+                      <a:extLst>
+                        <a:ext uri="{28A0092B-C50C-407E-A947-70E740481C1C}">
+                          <a14:useLocalDpi xmlns:a14="http://schemas.microsoft.com/office/drawing/2010/main" val="0"/>
+                        </a:ext>
+                      </a:extLst>
+                    </a:blip>
+                    <a:stretch>
+                      <a:fillRect/>
+                    </a:stretch>
+                  </pic:blipFill>
+                  <pic:spPr>
+                    <a:xfrm>
+                      <a:off x="0" y="0"/>
+                      <a:ext cx="720000" cy="720000"/>
+                    </a:xfrm>
+                    <a:prstGeom prst="rect">
+                      <a:avLst/>
+                    </a:prstGeom>
+                  </pic:spPr>
+                </pic:pic>
+              </a:graphicData>
+            </a:graphic>
+          </wp:inline>
+        </w:drawing>
+      </w:r>
+      <w:r>
+        <w:t xml:space="preserve">    </w:t>
+      </w:r>
+      <w:r>
+        <w:rPr>
+          <w:noProof/>
+        </w:rPr>
+        <w:drawing>
+          <wp:inline distT="0" distB="0" distL="0" distR="0" wp14:anchorId="21E8569D" wp14:editId="4C75996C">
+            <wp:extent cx="720000" cy="720000"/>
+            <wp:effectExtent l="0" t="0" r="4445" b="4445"/>
+            <wp:docPr id="253757314" name="图片 6"/>
+            <wp:cNvGraphicFramePr>
+              <a:graphicFrameLocks xmlns:a="http://schemas.openxmlformats.org/drawingml/2006/main" noChangeAspect="1"/>
+            </wp:cNvGraphicFramePr>
+            <a:graphic xmlns:a="http://schemas.openxmlformats.org/drawingml/2006/main">
+              <a:graphicData uri="http://schemas.openxmlformats.org/drawingml/2006/picture">
+                <pic:pic xmlns:pic="http://schemas.openxmlformats.org/drawingml/2006/picture">
+                  <pic:nvPicPr>
+                    <pic:cNvPr id="931392833" name="图片 931392833"/>
+                    <pic:cNvPicPr/>
+                  </pic:nvPicPr>
+                  <pic:blipFill>
+                    <a:blip r:embed="rId6" cstate="print">
+                      <a:extLst>
+                        <a:ext uri="{28A0092B-C50C-407E-A947-70E740481C1C}">
+                          <a14:useLocalDpi xmlns:a14="http://schemas.microsoft.com/office/drawing/2010/main" val="0"/>
+                        </a:ext>
+                      </a:extLst>
+                    </a:blip>
+                    <a:stretch>
+                      <a:fillRect/>
+                    </a:stretch>
+                  </pic:blipFill>
+                  <pic:spPr>
+                    <a:xfrm>
+                      <a:off x="0" y="0"/>
+                      <a:ext cx="720000" cy="720000"/>
+                    </a:xfrm>
+                    <a:prstGeom prst="rect">
+                      <a:avLst/>
+                    </a:prstGeom>
+                  </pic:spPr>
+                </pic:pic>
+              </a:graphicData>
+            </a:graphic>
+          </wp:inline>
+        </w:drawing>
+      </w:r>
+      <w:r>
+        <w:t xml:space="preserve">    </w:t>
+      </w:r>
+      <w:r>
+        <w:rPr>
+          <w:noProof/>
+        </w:rPr>
+        <w:drawing>
+          <wp:inline distT="0" distB="0" distL="0" distR="0" wp14:anchorId="2E01EF63" wp14:editId="56B081EF">
+            <wp:extent cx="720000" cy="720000"/>
+            <wp:effectExtent l="0" t="0" r="4445" b="4445"/>
+            <wp:docPr id="1869979376" name="图片 7"/>
+            <wp:cNvGraphicFramePr>
+              <a:graphicFrameLocks xmlns:a="http://schemas.openxmlformats.org/drawingml/2006/main" noChangeAspect="1"/>
+            </wp:cNvGraphicFramePr>
+            <a:graphic xmlns:a="http://schemas.openxmlformats.org/drawingml/2006/main">
+              <a:graphicData uri="http://schemas.openxmlformats.org/drawingml/2006/picture">
+                <pic:pic xmlns:pic="http://schemas.openxmlformats.org/drawingml/2006/picture">
+                  <pic:nvPicPr>
+                    <pic:cNvPr id="1121889337" name="图片 1121889337"/>
+                    <pic:cNvPicPr/>
+                  </pic:nvPicPr>
+                  <pic:blipFill>
+                    <a:blip r:embed="rId7" cstate="print">
+                      <a:extLst>
+                        <a:ext uri="{28A0092B-C50C-407E-A947-70E740481C1C}">
+                          <a14:useLocalDpi xmlns:a14="http://schemas.microsoft.com/office/drawing/2010/main" val="0"/>
+                        </a:ext>
+                      </a:extLst>
+                    </a:blip>
+                    <a:stretch>
+                      <a:fillRect/>
+                    </a:stretch>
+                  </pic:blipFill>
+                  <pic:spPr>
+                    <a:xfrm>
+                      <a:off x="0" y="0"/>
+                      <a:ext cx="720000" cy="720000"/>
+                    </a:xfrm>
+                    <a:prstGeom prst="rect">
+                      <a:avLst/>
+                    </a:prstGeom>
+                  </pic:spPr>
+                </pic:pic>
+              </a:graphicData>
+            </a:graphic>
+          </wp:inline>
+        </w:drawing>
+      </w:r>
+    </w:p>
+    <w:p/>
+    <w:p>
+      <w:r>
+        <w:rPr>
+          <w:noProof/>
+        </w:rPr>
+        <w:drawing>
+          <wp:inline distT="0" distB="0" distL="0" distR="0" wp14:anchorId="2116C48E" wp14:editId="678439F6">
+            <wp:extent cx="720000" cy="720000"/>
+            <wp:effectExtent l="0" t="0" r="4445" b="4445"/>
+            <wp:docPr id="1507254782" name="图片 1"/>
+            <wp:cNvGraphicFramePr>
+              <a:graphicFrameLocks xmlns:a="http://schemas.openxmlformats.org/drawingml/2006/main" noChangeAspect="1"/>
+            </wp:cNvGraphicFramePr>
+            <a:graphic xmlns:a="http://schemas.openxmlformats.org/drawingml/2006/main">
+              <a:graphicData uri="http://schemas.openxmlformats.org/drawingml/2006/picture">
+                <pic:pic xmlns:pic="http://schemas.openxmlformats.org/drawingml/2006/picture">
+                  <pic:nvPicPr>
+                    <pic:cNvPr id="1524649862" name="图片 1524649862"/>
+                    <pic:cNvPicPr/>
+                  </pic:nvPicPr>
+                  <pic:blipFill>
+                    <a:blip r:embed="rId4" cstate="print">
+                      <a:extLst>
+                        <a:ext uri="{28A0092B-C50C-407E-A947-70E740481C1C}">
+                          <a14:useLocalDpi xmlns:a14="http://schemas.microsoft.com/office/drawing/2010/main" val="0"/>
+                        </a:ext>
+                      </a:extLst>
+                    </a:blip>
+                    <a:stretch>
+                      <a:fillRect/>
+                    </a:stretch>
+                  </pic:blipFill>
+                  <pic:spPr>
+                    <a:xfrm>
+                      <a:off x="0" y="0"/>
+                      <a:ext cx="720000" cy="720000"/>
+                    </a:xfrm>
+                    <a:prstGeom prst="rect">
+                      <a:avLst/>
+                    </a:prstGeom>
+                  </pic:spPr>
+                </pic:pic>
+              </a:graphicData>
+            </a:graphic>
+          </wp:inline>
+        </w:drawing>
+      </w:r>
+      <w:r>
+        <w:t xml:space="preserve">    </w:t>
+      </w:r>
+      <w:r>
+        <w:rPr>
+          <w:noProof/>
+        </w:rPr>
+        <w:drawing>
+          <wp:inline distT="0" distB="0" distL="0" distR="0" wp14:anchorId="0942B336" wp14:editId="12D74524">
+            <wp:extent cx="720000" cy="720000"/>
+            <wp:effectExtent l="0" t="0" r="4445" b="4445"/>
+            <wp:docPr id="391441118" name="图片 5"/>
+            <wp:cNvGraphicFramePr>
+              <a:graphicFrameLocks xmlns:a="http://schemas.openxmlformats.org/drawingml/2006/main" noChangeAspect="1"/>
+            </wp:cNvGraphicFramePr>
+            <a:graphic xmlns:a="http://schemas.openxmlformats.org/drawingml/2006/main">
+              <a:graphicData uri="http://schemas.openxmlformats.org/drawingml/2006/picture">
+                <pic:pic xmlns:pic="http://schemas.openxmlformats.org/drawingml/2006/picture">
+                  <pic:nvPicPr>
+                    <pic:cNvPr id="1371579297" name="图片 1371579297"/>
+                    <pic:cNvPicPr/>
+                  </pic:nvPicPr>
+                  <pic:blipFill>
+                    <a:blip r:embed="rId5" cstate="print">
+                      <a:extLst>
+                        <a:ext uri="{28A0092B-C50C-407E-A947-70E740481C1C}">
+                          <a14:useLocalDpi xmlns:a14="http://schemas.microsoft.com/office/drawing/2010/main" val="0"/>
+                        </a:ext>
+                      </a:extLst>
+                    </a:blip>
+                    <a:stretch>
+                      <a:fillRect/>
+                    </a:stretch>
+                  </pic:blipFill>
+                  <pic:spPr>
+                    <a:xfrm>
+                      <a:off x="0" y="0"/>
+                      <a:ext cx="720000" cy="720000"/>
+                    </a:xfrm>
+                    <a:prstGeom prst="rect">
+                      <a:avLst/>
+                    </a:prstGeom>
+                  </pic:spPr>
+                </pic:pic>
+              </a:graphicData>
+            </a:graphic>
+          </wp:inline>
+        </w:drawing>
+      </w:r>
+      <w:r>
+        <w:t xml:space="preserve">    </w:t>
+      </w:r>
+      <w:r>
+        <w:rPr>
+          <w:noProof/>
+        </w:rPr>
+        <w:drawing>
+          <wp:inline distT="0" distB="0" distL="0" distR="0" wp14:anchorId="164616EA" wp14:editId="62E1FDEC">
+            <wp:extent cx="720000" cy="720000"/>
+            <wp:effectExtent l="0" t="0" r="4445" b="4445"/>
+            <wp:docPr id="485796636" name="图片 6"/>
+            <wp:cNvGraphicFramePr>
+              <a:graphicFrameLocks xmlns:a="http://schemas.openxmlformats.org/drawingml/2006/main" noChangeAspect="1"/>
+            </wp:cNvGraphicFramePr>
+            <a:graphic xmlns:a="http://schemas.openxmlformats.org/drawingml/2006/main">
+              <a:graphicData uri="http://schemas.openxmlformats.org/drawingml/2006/picture">
+                <pic:pic xmlns:pic="http://schemas.openxmlformats.org/drawingml/2006/picture">
+                  <pic:nvPicPr>
+                    <pic:cNvPr id="931392833" name="图片 931392833"/>
+                    <pic:cNvPicPr/>
+                  </pic:nvPicPr>
+                  <pic:blipFill>
+                    <a:blip r:embed="rId6" cstate="print">
+                      <a:extLst>
+                        <a:ext uri="{28A0092B-C50C-407E-A947-70E740481C1C}">
+                          <a14:useLocalDpi xmlns:a14="http://schemas.microsoft.com/office/drawing/2010/main" val="0"/>
+                        </a:ext>
+                      </a:extLst>
+                    </a:blip>
+                    <a:stretch>
+                      <a:fillRect/>
+                    </a:stretch>
+                  </pic:blipFill>
+                  <pic:spPr>
+                    <a:xfrm>
+                      <a:off x="0" y="0"/>
+                      <a:ext cx="720000" cy="720000"/>
+                    </a:xfrm>
+                    <a:prstGeom prst="rect">
+                      <a:avLst/>
+                    </a:prstGeom>
+                  </pic:spPr>
+                </pic:pic>
+              </a:graphicData>
+            </a:graphic>
+          </wp:inline>
+        </w:drawing>
+      </w:r>
+      <w:r>
+        <w:t xml:space="preserve">    </w:t>
+      </w:r>
+      <w:r>
+        <w:rPr>
+          <w:noProof/>
+        </w:rPr>
+        <w:drawing>
+          <wp:inline distT="0" distB="0" distL="0" distR="0" wp14:anchorId="3AAB4021" wp14:editId="45658667">
+            <wp:extent cx="720000" cy="720000"/>
+            <wp:effectExtent l="0" t="0" r="4445" b="4445"/>
+            <wp:docPr id="1224650237" name="图片 7"/>
+            <wp:cNvGraphicFramePr>
+              <a:graphicFrameLocks xmlns:a="http://schemas.openxmlformats.org/drawingml/2006/main" noChangeAspect="1"/>
+            </wp:cNvGraphicFramePr>
+            <a:graphic xmlns:a="http://schemas.openxmlformats.org/drawingml/2006/main">
+              <a:graphicData uri="http://schemas.openxmlformats.org/drawingml/2006/picture">
+                <pic:pic xmlns:pic="http://schemas.openxmlformats.org/drawingml/2006/picture">
+                  <pic:nvPicPr>
+                    <pic:cNvPr id="1121889337" name="图片 1121889337"/>
+                    <pic:cNvPicPr/>
+                  </pic:nvPicPr>
+                  <pic:blipFill>
+                    <a:blip r:embed="rId7" cstate="print">
+                      <a:extLst>
+                        <a:ext uri="{28A0092B-C50C-407E-A947-70E740481C1C}">
+                          <a14:useLocalDpi xmlns:a14="http://schemas.microsoft.com/office/drawing/2010/main" val="0"/>
+                        </a:ext>
+                      </a:extLst>
+                    </a:blip>
+                    <a:stretch>
+                      <a:fillRect/>
+                    </a:stretch>
+                  </pic:blipFill>
+                  <pic:spPr>
+                    <a:xfrm>
+                      <a:off x="0" y="0"/>
+                      <a:ext cx="720000" cy="720000"/>
                     </a:xfrm>
                     <a:prstGeom prst="rect">
                       <a:avLst/>
@@ -1179,14 +1767,22 @@
     </w:p>
     <w:p>
       <w:r>
-        <w:t xml:space="preserve">       0                  1                    2                  3</w:t>
+        <w:t xml:space="preserve">     0.             1             2              3</w:t>
       </w:r>
     </w:p>
     <w:p/>
-    <w:p/>
     <w:p>
       <w:r>
-        <w:t>30mm x 30mm</w:t>
+        <w:t>2</w:t>
+      </w:r>
+      <w:r>
+        <w:t xml:space="preserve">0mm x </w:t>
+      </w:r>
+      <w:r>
+        <w:t>2</w:t>
+      </w:r>
+      <w:r>
+        <w:t>0mm</w:t>
       </w:r>
     </w:p>
     <w:sectPr>

</xml_diff>